<commit_message>
fix(resume): correct the Rarify stack and cut the project list to three
The Rarify entry claimed Next.js, PostgreSQL, and a Vercel deployment. The repo
is a Vite and React SPA over a type-safe Effect HTTP API on Cloudflare Workers
with a D1 SQLite store, so the resume described a stack that does not exist.

- Correct the Rarify stack line and its first bullet
- Keep Subby, ReFactor, and Rarify; drop TrailFinder, RustyVault, and LFGuild
- Generate the PDF from the HTML with headless Chrome. The script previously
  wrote only TXT, Markdown, and HTML, which is how the PDF kept the old claims
  even after the DOCX was corrected
- Add print styling for the PDF: Letter, one page, and a light palette that does
  not follow the reader's dark mode

The DOCX stays the source of truth; only its text nodes changed, so the Word
formatting and styles are untouched.
</commit_message>
<xml_diff>
--- a/public/George_Suarez_Resume.docx
+++ b/public/George_Suarez_Resume.docx
@@ -556,7 +556,7 @@
           <w:b w:val="0"/>
           <w:sz w:val="19"/>
         </w:rPr>
-        <w:t xml:space="preserve"> | TypeScript, Next.js, Tailwind CSS, PostgreSQL</w:t>
+        <w:t xml:space="preserve"> | TypeScript, Effect, React, Tailwind CSS, Cloudflare Workers, SQLite</w:t>
       </w:r>
     </w:p>
     <w:p>
@@ -578,7 +578,7 @@
           <w:b w:val="0"/>
           <w:sz w:val="19"/>
         </w:rPr>
-        <w:t>Built and deployed a Steam achievement dashboard to production on Vercel using Next.js, TypeScript, Tailwind CSS, and PostgreSQL</w:t>
+        <w:t>Built and deployed a Steam achievement dashboard on Cloudflare Workers: a React single-page app over a type-safe Effect HTTP API, backed by a D1 SQLite store</w:t>
       </w:r>
     </w:p>
     <w:p>
@@ -601,201 +601,6 @@
           <w:sz w:val="19"/>
         </w:rPr>
         <w:t>Integrated Steam OpenID authentication, JWT sessions, and a cached Steam API client with nightly snapshot jobs for tracking progress over time</w:t>
-      </w:r>
-    </w:p>
-    <w:p>
-      <w:pPr>
-        <w:spacing w:before="70" w:after="10"/>
-      </w:pPr>
-      <w:r>
-        <w:rPr>
-          <w:rFonts w:ascii="Arial" w:hAnsi="Arial"/>
-          <w:b/>
-          <w:sz w:val="19"/>
-        </w:rPr>
-        <w:t>TrailFinder</w:t>
-      </w:r>
-      <w:r>
-        <w:rPr>
-          <w:rFonts w:ascii="Arial" w:hAnsi="Arial"/>
-          <w:b w:val="0"/>
-          <w:sz w:val="19"/>
-        </w:rPr>
-        <w:t xml:space="preserve"> | TypeScript, Effect TS, React, Cloudflare Workers</w:t>
-      </w:r>
-    </w:p>
-    <w:p>
-      <w:pPr>
-        <w:spacing w:after="16"/>
-        <w:ind w:left="230" w:hanging="144"/>
-      </w:pPr>
-      <w:r>
-        <w:rPr>
-          <w:rFonts w:ascii="Arial" w:hAnsi="Arial"/>
-          <w:b w:val="0"/>
-          <w:sz w:val="19"/>
-        </w:rPr>
-        <w:t xml:space="preserve">- </w:t>
-      </w:r>
-      <w:r>
-        <w:rPr>
-          <w:rFonts w:ascii="Arial" w:hAnsi="Arial"/>
-          <w:b w:val="0"/>
-          <w:sz w:val="19"/>
-        </w:rPr>
-        <w:t>Built a full-stack trail finder on Cloudflare Workers with a type-safe Effect TS HTTP API featuring schema validation, typed errors, and retry with timeout</w:t>
-      </w:r>
-    </w:p>
-    <w:p>
-      <w:pPr>
-        <w:spacing w:after="16"/>
-        <w:ind w:left="230" w:hanging="144"/>
-      </w:pPr>
-      <w:r>
-        <w:rPr>
-          <w:rFonts w:ascii="Arial" w:hAnsi="Arial"/>
-          <w:b w:val="0"/>
-          <w:sz w:val="19"/>
-        </w:rPr>
-        <w:t xml:space="preserve">- </w:t>
-      </w:r>
-      <w:r>
-        <w:rPr>
-          <w:rFonts w:ascii="Arial" w:hAnsi="Arial"/>
-          <w:b w:val="0"/>
-          <w:sz w:val="19"/>
-        </w:rPr>
-        <w:t>Integrated OpenStreetMap Overpass and Nominatim APIs to query, decode, and distance-sort hiking routes onto an interactive React and Leaflet map</w:t>
-      </w:r>
-    </w:p>
-    <w:p>
-      <w:pPr>
-        <w:spacing w:before="70" w:after="10"/>
-      </w:pPr>
-      <w:r>
-        <w:rPr>
-          <w:rFonts w:ascii="Arial" w:hAnsi="Arial"/>
-          <w:b/>
-          <w:sz w:val="19"/>
-        </w:rPr>
-        <w:t>RustyVault</w:t>
-      </w:r>
-      <w:r>
-        <w:rPr>
-          <w:rFonts w:ascii="Arial" w:hAnsi="Arial"/>
-          <w:b w:val="0"/>
-          <w:sz w:val="19"/>
-        </w:rPr>
-        <w:t xml:space="preserve"> | Rust, SQLite</w:t>
-      </w:r>
-    </w:p>
-    <w:p>
-      <w:pPr>
-        <w:spacing w:after="16"/>
-        <w:ind w:left="230" w:hanging="144"/>
-      </w:pPr>
-      <w:r>
-        <w:rPr>
-          <w:rFonts w:ascii="Arial" w:hAnsi="Arial"/>
-          <w:b w:val="0"/>
-          <w:sz w:val="19"/>
-        </w:rPr>
-        <w:t xml:space="preserve">- </w:t>
-      </w:r>
-      <w:r>
-        <w:rPr>
-          <w:rFonts w:ascii="Arial" w:hAnsi="Arial"/>
-          <w:b w:val="0"/>
-          <w:sz w:val="19"/>
-        </w:rPr>
-        <w:t>Built a Rust terminal credential manager (Ratatui TUI) that encrypts passwords and API keys with AES-256-GCM and Argon2id-derived keys in a local SQLite database</w:t>
-      </w:r>
-    </w:p>
-    <w:p>
-      <w:pPr>
-        <w:spacing w:after="16"/>
-        <w:ind w:left="230" w:hanging="144"/>
-      </w:pPr>
-      <w:r>
-        <w:rPr>
-          <w:rFonts w:ascii="Arial" w:hAnsi="Arial"/>
-          <w:b w:val="0"/>
-          <w:sz w:val="19"/>
-        </w:rPr>
-        <w:t xml:space="preserve">- </w:t>
-      </w:r>
-      <w:r>
-        <w:rPr>
-          <w:rFonts w:ascii="Arial" w:hAnsi="Arial"/>
-          <w:b w:val="0"/>
-          <w:sz w:val="19"/>
-        </w:rPr>
-        <w:t>Implemented atomic master-password rotation, on-demand secret reveal, and memory scrubbing on lock and quit, with no network access</w:t>
-      </w:r>
-    </w:p>
-    <w:p>
-      <w:pPr>
-        <w:spacing w:before="70" w:after="10"/>
-      </w:pPr>
-      <w:r>
-        <w:rPr>
-          <w:rFonts w:ascii="Arial" w:hAnsi="Arial"/>
-          <w:b/>
-          <w:sz w:val="19"/>
-        </w:rPr>
-        <w:t>LFGuild</w:t>
-      </w:r>
-      <w:r>
-        <w:rPr>
-          <w:rFonts w:ascii="Arial" w:hAnsi="Arial"/>
-          <w:b w:val="0"/>
-          <w:sz w:val="19"/>
-        </w:rPr>
-        <w:t xml:space="preserve"> | Swift, SwiftUI, Firebase</w:t>
-      </w:r>
-    </w:p>
-    <w:p>
-      <w:pPr>
-        <w:spacing w:after="16"/>
-        <w:ind w:left="230" w:hanging="144"/>
-      </w:pPr>
-      <w:r>
-        <w:rPr>
-          <w:rFonts w:ascii="Arial" w:hAnsi="Arial"/>
-          <w:b w:val="0"/>
-          <w:sz w:val="19"/>
-        </w:rPr>
-        <w:t xml:space="preserve">- </w:t>
-      </w:r>
-      <w:r>
-        <w:rPr>
-          <w:rFonts w:ascii="Arial" w:hAnsi="Arial"/>
-          <w:b w:val="0"/>
-          <w:sz w:val="19"/>
-        </w:rPr>
-        <w:t>Built an iOS guild-matching application with SwiftUI and MVVM using Firebase Auth, Firestore, Cloud Messaging, and real-time chat with unread tracking</w:t>
-      </w:r>
-    </w:p>
-    <w:p>
-      <w:pPr>
-        <w:spacing w:after="16"/>
-        <w:ind w:left="230" w:hanging="144"/>
-      </w:pPr>
-      <w:r>
-        <w:rPr>
-          <w:rFonts w:ascii="Arial" w:hAnsi="Arial"/>
-          <w:b w:val="0"/>
-          <w:sz w:val="19"/>
-        </w:rPr>
-        <w:t xml:space="preserve">- </w:t>
-      </w:r>
-      <w:r>
-        <w:rPr>
-          <w:rFonts w:ascii="Arial" w:hAnsi="Arial"/>
-          <w:b w:val="0"/>
-          <w:sz w:val="19"/>
-        </w:rPr>
-        <w:t>Designed a weighted six-factor match-scoring algorithm and Firestore security rules enforcing verified-email and owner-only access</w:t>
       </w:r>
     </w:p>
     <w:sectPr>

</xml_diff>